<commit_message>
Add compact consent-gated analytics
</commit_message>
<xml_diff>
--- a/docs/legal/docx/03-cookie-policy.docx
+++ b/docs/legal/docx/03-cookie-policy.docx
@@ -30,7 +30,7 @@
         <w:t>Редакция:</w:t>
       </w:r>
       <w:r>
-        <w:t xml:space="preserve"> 3.0 от 18 августа 2026 года</w:t>
+        <w:t xml:space="preserve"> 3.1 от 19 августа 2026 года</w:t>
       </w:r>
     </w:p>
     <w:p>
@@ -366,7 +366,7 @@
           </w:tcPr>
           <w:p>
             <w:r>
-              <w:t>будущие события посещения и ошибок</w:t>
+              <w:t>случайный идентификатор аналитической сессии, время, событие и укрупнённый раздел сайта</w:t>
             </w:r>
           </w:p>
         </w:tc>
@@ -382,7 +382,7 @@
           </w:tcPr>
           <w:p>
             <w:r>
-              <w:t>выключены по умолчанию; только после «Разрешить аналитику»</w:t>
+              <w:t>выключены по умолчанию; только после «Разрешить»</w:t>
             </w:r>
           </w:p>
         </w:tc>
@@ -501,7 +501,27 @@
         <w:t>catalog-map-tiles</w:t>
       </w:r>
       <w:r>
-        <w:t>. Прежние технические имена WayCatalog сохраняются до миграции бренда.</w:t>
+        <w:t xml:space="preserve">. Выбор аналитики хранится в </w:t>
+      </w:r>
+      <w:r>
+        <w:rPr>
+          <w:rFonts w:ascii="Courier New" w:hAnsi="Courier New"/>
+          <w:sz w:val="18"/>
+        </w:rPr>
+        <w:t>wayyaam:cookie-choice:3.1</w:t>
+      </w:r>
+      <w:r>
+        <w:t xml:space="preserve">, а случайный идентификатор аналитической сессии — в </w:t>
+      </w:r>
+      <w:r>
+        <w:rPr>
+          <w:rFonts w:ascii="Courier New" w:hAnsi="Courier New"/>
+          <w:sz w:val="18"/>
+        </w:rPr>
+        <w:t>wayyaam:analytics-session:3.1</w:t>
+      </w:r>
+      <w:r>
+        <w:t xml:space="preserve"> только после разрешения. Прежние технические имена WayCatalog сохраняются до миграции бренда.</w:t>
       </w:r>
     </w:p>
     <w:p>
@@ -514,7 +534,7 @@
     </w:p>
     <w:p>
       <w:r>
-        <w:t>Сессия клиента рассчитана не более чем на 30 дней; конкретные TTL остальных ключей должны быть реализованы согласно Политике обработки. Баннер сохраняет версию выбора и время. Отказ от аналитики не блокирует базовый сервис. Выбор можно изменить через «Настройки cookies» или очистку данных сайта в браузере.</w:t>
+        <w:t>Сессия клиента рассчитана не более чем на 30 дней. Аналитические события хранятся не более 90 дней. Баннер сохраняет версию выбора и время. Отказ от аналитики не блокирует базовый сервис. При отзыве через «Настройки cookies» сбор немедленно прекращается, сервер удаляет события этой аналитической сессии, а её локальный идентификатор удаляется.</w:t>
       </w:r>
     </w:p>
     <w:p>
@@ -522,12 +542,77 @@
         <w:pStyle w:val="Heading1"/>
       </w:pPr>
       <w:r>
-        <w:t>5. Третьи стороны</w:t>
+        <w:t>5. Как работает аналитика</w:t>
       </w:r>
     </w:p>
     <w:p>
       <w:r>
-        <w:t>Карта, push, хостинг и внешние изображения могут получать IP, user-agent и параметры запроса. До запуска внешний список должен быть приведён в соответствие фактической российской архитектуре. Подключение аналитики требует обновления таблицы провайдеров, целей, сроков и стран до отправки первого события.</w:t>
+        <w:t xml:space="preserve">Аналитика является собственной и отправляет данные только на API WayYaam </w:t>
+      </w:r>
+      <w:r>
+        <w:rPr>
+          <w:rFonts w:ascii="Courier New" w:hAnsi="Courier New"/>
+          <w:sz w:val="18"/>
+        </w:rPr>
+        <w:t>api.wayyaam.ru</w:t>
+      </w:r>
+      <w:r>
+        <w:t xml:space="preserve"> в текущей российской инфраструктуре. Записываются только события </w:t>
+      </w:r>
+      <w:r>
+        <w:rPr>
+          <w:rFonts w:ascii="Courier New" w:hAnsi="Courier New"/>
+          <w:sz w:val="18"/>
+        </w:rPr>
+        <w:t>analytics_enabled</w:t>
+      </w:r>
+      <w:r>
+        <w:t xml:space="preserve"> и </w:t>
+      </w:r>
+      <w:r>
+        <w:rPr>
+          <w:rFonts w:ascii="Courier New" w:hAnsi="Courier New"/>
+          <w:sz w:val="18"/>
+        </w:rPr>
+        <w:t>page_view</w:t>
+      </w:r>
+      <w:r>
+        <w:t>, случайный идентификатор сессии, укрупнённый раздел (</w:t>
+      </w:r>
+      <w:r>
+        <w:rPr>
+          <w:rFonts w:ascii="Courier New" w:hAnsi="Courier New"/>
+          <w:sz w:val="18"/>
+        </w:rPr>
+        <w:t>/catalog</w:t>
+      </w:r>
+      <w:r>
+        <w:t xml:space="preserve">, </w:t>
+      </w:r>
+      <w:r>
+        <w:rPr>
+          <w:rFonts w:ascii="Courier New" w:hAnsi="Courier New"/>
+          <w:sz w:val="18"/>
+        </w:rPr>
+        <w:t>/checkout</w:t>
+      </w:r>
+      <w:r>
+        <w:t xml:space="preserve">, </w:t>
+      </w:r>
+      <w:r>
+        <w:rPr>
+          <w:rFonts w:ascii="Courier New" w:hAnsi="Courier New"/>
+          <w:sz w:val="18"/>
+        </w:rPr>
+        <w:t>/profile</w:t>
+      </w:r>
+      <w:r>
+        <w:t xml:space="preserve"> и подобные) и серверное время. Имя, телефон, адрес, координаты, состав и номер заказа, параметры URL, полный путь ресторана, referrer и user-agent в таблицу аналитики не записываются. Яндекс Метрика, Google Analytics, рекламное профилирование и Webvisor не подключены.</w:t>
+      </w:r>
+    </w:p>
+    <w:p>
+      <w:r>
+        <w:t>Карта, push, хостинг и внешние изображения могут получать технические параметры запроса при использовании соответствующей функции; они не включаются кнопкой аналитики.</w:t>
       </w:r>
     </w:p>
     <w:p>

</xml_diff>